<commit_message>
Isolate Lab 8-10 stack and format report to prior standard
</commit_message>
<xml_diff>
--- a/lab8_10_backend/Лабораторна робота №8-10 - Гнатишак Андрій.docx
+++ b/lab8_10_backend/Лабораторна робота №8-10 - Гнатишак Андрій.docx
@@ -4,92 +4,107 @@
   <w:body>
     <w:p>
       <w:pPr>
-        <w:spacing w:after="100"/>
+        <w:spacing w:after="100" w:line="360" w:lineRule="auto"/>
         <w:jc w:val="center"/>
       </w:pPr>
       <w:r>
         <w:rPr>
-          <w:rFonts w:ascii="Arial" w:hAnsi="Arial"/>
-          <w:sz w:val="22"/>
+          <w:rFonts w:ascii="Times New Roman" w:hAnsi="Times New Roman" w:eastAsia="Times New Roman"/>
+          <w:sz w:val="28"/>
         </w:rPr>
         <w:t>Міністерство освіти і науки України</w:t>
       </w:r>
     </w:p>
     <w:p>
       <w:pPr>
-        <w:spacing w:after="100"/>
+        <w:spacing w:after="100" w:line="360" w:lineRule="auto"/>
         <w:jc w:val="center"/>
       </w:pPr>
       <w:r>
         <w:rPr>
-          <w:rFonts w:ascii="Arial" w:hAnsi="Arial"/>
-          <w:sz w:val="24"/>
+          <w:rFonts w:ascii="Times New Roman" w:hAnsi="Times New Roman" w:eastAsia="Times New Roman"/>
+          <w:sz w:val="28"/>
         </w:rPr>
         <w:t>Карпатський національний університет імені Василя Стефаника</w:t>
       </w:r>
     </w:p>
     <w:p>
       <w:pPr>
-        <w:spacing w:after="100"/>
+        <w:spacing w:after="100" w:line="360" w:lineRule="auto"/>
         <w:jc w:val="center"/>
       </w:pPr>
       <w:r>
         <w:rPr>
-          <w:rFonts w:ascii="Arial" w:hAnsi="Arial"/>
-          <w:sz w:val="22"/>
+          <w:rFonts w:ascii="Times New Roman" w:hAnsi="Times New Roman" w:eastAsia="Times New Roman"/>
+          <w:sz w:val="28"/>
         </w:rPr>
         <w:t>Факультет математики та інформатики</w:t>
       </w:r>
     </w:p>
     <w:p>
       <w:pPr>
-        <w:spacing w:after="100"/>
+        <w:spacing w:after="100" w:line="360" w:lineRule="auto"/>
         <w:jc w:val="center"/>
       </w:pPr>
       <w:r>
         <w:rPr>
-          <w:rFonts w:ascii="Arial" w:hAnsi="Arial"/>
-          <w:sz w:val="22"/>
+          <w:rFonts w:ascii="Times New Roman" w:hAnsi="Times New Roman" w:eastAsia="Times New Roman"/>
+          <w:sz w:val="28"/>
         </w:rPr>
         <w:t>Кафедра інформаційних технологій</w:t>
       </w:r>
     </w:p>
     <w:p>
       <w:pPr>
-        <w:spacing w:after="100"/>
+        <w:spacing w:after="100" w:line="360" w:lineRule="auto"/>
         <w:jc w:val="center"/>
       </w:pPr>
       <w:r>
         <w:rPr>
-          <w:rFonts w:ascii="Arial" w:hAnsi="Arial"/>
-          <w:sz w:val="22"/>
+          <w:rFonts w:ascii="Times New Roman" w:hAnsi="Times New Roman" w:eastAsia="Times New Roman"/>
+          <w:sz w:val="28"/>
         </w:rPr>
         <w:t>Дисципліна: Професійна практика програмної інженерії</w:t>
       </w:r>
     </w:p>
-    <w:p/>
-    <w:p/>
-    <w:p/>
     <w:p>
       <w:pPr>
+        <w:spacing w:line="360" w:lineRule="auto"/>
+      </w:pPr>
+    </w:p>
+    <w:p>
+      <w:pPr>
+        <w:spacing w:line="360" w:lineRule="auto"/>
+      </w:pPr>
+    </w:p>
+    <w:p>
+      <w:pPr>
+        <w:spacing w:line="360" w:lineRule="auto"/>
+      </w:pPr>
+    </w:p>
+    <w:p>
+      <w:pPr>
+        <w:spacing w:line="360" w:lineRule="auto"/>
         <w:jc w:val="center"/>
       </w:pPr>
       <w:r>
         <w:rPr>
+          <w:rFonts w:ascii="Times New Roman" w:hAnsi="Times New Roman" w:eastAsia="Times New Roman"/>
           <w:b/>
           <w:color w:val="17365D"/>
-          <w:sz w:val="36"/>
+          <w:sz w:val="32"/>
         </w:rPr>
         <w:t>ЛАБОРАТОРНА РОБОТА № 8–10</w:t>
       </w:r>
     </w:p>
     <w:p>
       <w:pPr>
-        <w:spacing w:before="120"/>
+        <w:spacing w:before="120" w:line="360" w:lineRule="auto"/>
         <w:jc w:val="center"/>
       </w:pPr>
       <w:r>
         <w:rPr>
+          <w:rFonts w:ascii="Times New Roman" w:hAnsi="Times New Roman" w:eastAsia="Times New Roman"/>
           <w:b/>
           <w:color w:val="17365D"/>
           <w:sz w:val="32"/>
@@ -97,71 +112,138 @@
         <w:t>РЕАЛІЗАЦІЯ BACKEND ПРОГРАМНОГО ПРОДУКТУ</w:t>
       </w:r>
     </w:p>
-    <w:p/>
-    <w:p/>
-    <w:p/>
     <w:p>
       <w:pPr>
+        <w:spacing w:line="360" w:lineRule="auto"/>
+      </w:pPr>
+    </w:p>
+    <w:p>
+      <w:pPr>
+        <w:spacing w:line="360" w:lineRule="auto"/>
+      </w:pPr>
+    </w:p>
+    <w:p>
+      <w:pPr>
+        <w:spacing w:line="360" w:lineRule="auto"/>
+      </w:pPr>
+    </w:p>
+    <w:p>
+      <w:pPr>
+        <w:spacing w:line="360" w:lineRule="auto"/>
         <w:jc w:val="right"/>
       </w:pPr>
       <w:r>
         <w:rPr>
-          <w:sz w:val="22"/>
+          <w:rFonts w:ascii="Times New Roman" w:hAnsi="Times New Roman" w:eastAsia="Times New Roman"/>
+          <w:sz w:val="28"/>
         </w:rPr>
         <w:t>Виконав: студент групи ІПЗ-41</w:t>
         <w:br/>
       </w:r>
       <w:r>
         <w:rPr>
-          <w:sz w:val="22"/>
+          <w:rFonts w:ascii="Times New Roman" w:hAnsi="Times New Roman" w:eastAsia="Times New Roman"/>
+          <w:sz w:val="28"/>
         </w:rPr>
         <w:t>Гнатишак Андрій Йосипович</w:t>
         <w:br/>
       </w:r>
       <w:r>
         <w:rPr>
-          <w:sz w:val="22"/>
+          <w:rFonts w:ascii="Times New Roman" w:hAnsi="Times New Roman" w:eastAsia="Times New Roman"/>
+          <w:sz w:val="28"/>
         </w:rPr>
         <w:t>Перевірив: Пікуляк М. В.</w:t>
         <w:br/>
       </w:r>
     </w:p>
-    <w:p/>
-    <w:p/>
-    <w:p/>
     <w:p>
       <w:pPr>
+        <w:spacing w:line="360" w:lineRule="auto"/>
+      </w:pPr>
+    </w:p>
+    <w:p>
+      <w:pPr>
+        <w:spacing w:line="360" w:lineRule="auto"/>
+      </w:pPr>
+    </w:p>
+    <w:p>
+      <w:pPr>
+        <w:spacing w:line="360" w:lineRule="auto"/>
+      </w:pPr>
+    </w:p>
+    <w:p>
+      <w:pPr>
+        <w:spacing w:line="360" w:lineRule="auto"/>
         <w:jc w:val="center"/>
       </w:pPr>
       <w:r>
+        <w:rPr>
+          <w:rFonts w:ascii="Times New Roman" w:hAnsi="Times New Roman" w:eastAsia="Times New Roman"/>
+          <w:sz w:val="28"/>
+        </w:rPr>
         <w:t>Івано-Франківськ – 2026</w:t>
       </w:r>
     </w:p>
     <w:p>
+      <w:pPr>
+        <w:spacing w:line="360" w:lineRule="auto"/>
+      </w:pPr>
       <w:r>
+        <w:rPr>
+          <w:rFonts w:ascii="Times New Roman" w:hAnsi="Times New Roman" w:eastAsia="Times New Roman"/>
+          <w:sz w:val="28"/>
+        </w:rPr>
         <w:br w:type="page"/>
       </w:r>
     </w:p>
     <w:p>
       <w:pPr>
-        <w:pStyle w:val="Title"/>
+        <w:spacing w:line="360" w:lineRule="auto" w:after="280"/>
+        <w:jc w:val="center"/>
       </w:pPr>
       <w:r>
+        <w:rPr>
+          <w:rFonts w:ascii="Times New Roman" w:hAnsi="Times New Roman" w:eastAsia="Times New Roman"/>
+          <w:b/>
+          <w:color w:val="000000"/>
+          <w:sz w:val="32"/>
+        </w:rPr>
         <w:t>Лабораторна робота № 8–10. Реалізація backend програмного продукту</w:t>
       </w:r>
     </w:p>
     <w:p>
+      <w:pPr>
+        <w:spacing w:line="360" w:lineRule="auto"/>
+        <w:jc w:val="left"/>
+      </w:pPr>
       <w:r>
-        <w:t>Тема проєкту: розроблення вебзастосунку для обліку робочого часу працівників.</w:t>
+        <w:t>Тема проєкту – розроблення вебзастосунку для обліку робочого часу працівників.</w:t>
       </w:r>
     </w:p>
     <w:p>
+      <w:pPr>
+        <w:spacing w:line="360" w:lineRule="auto"/>
+        <w:jc w:val="both"/>
+      </w:pPr>
       <w:r>
+        <w:rPr>
+          <w:rFonts w:ascii="Times New Roman" w:hAnsi="Times New Roman" w:eastAsia="Times New Roman"/>
+          <w:sz w:val="28"/>
+        </w:rPr>
         <w:t>Мета роботи: реалізувати серверну частину раніше спроєктованої системи, з’єднати її з наявною базою PostgreSQL та фронтендом Next.js, забезпечити REST API, перевірку даних і рольовий контроль доступу. У результаті готовий клієнт працює з реальними даними через FastAPI, а весь проєкт запускається узгодженими Docker Compose сервісами.</w:t>
       </w:r>
     </w:p>
     <w:p>
+      <w:pPr>
+        <w:spacing w:line="360" w:lineRule="auto"/>
+        <w:jc w:val="both"/>
+      </w:pPr>
       <w:r>
+        <w:rPr>
+          <w:rFonts w:ascii="Times New Roman" w:hAnsi="Times New Roman" w:eastAsia="Times New Roman"/>
+          <w:sz w:val="28"/>
+        </w:rPr>
         <w:t>Технологічний стек продовжує рішення попередніх лабораторних: фронтенд Next.js 14 + TypeScript, наявна схема PostgreSQL із лабораторної № 5, контракт взаємодії фронтенду з лабораторної № 6–7 і багаторівнева архітектура, визначена раніше. Для backend використано Python 3.12, FastAPI, SQLAlchemy 2, psycopg 3, JWT та Argon2. База даних не замінювалась і не дублювалась.</w:t>
       </w:r>
     </w:p>
@@ -169,18 +251,41 @@
       <w:pPr>
         <w:pStyle w:val="Heading1"/>
         <w:keepNext/>
+        <w:spacing w:line="360" w:lineRule="auto" w:before="280" w:after="160"/>
+        <w:jc w:val="left"/>
       </w:pPr>
       <w:r>
+        <w:rPr>
+          <w:rFonts w:ascii="Times New Roman" w:hAnsi="Times New Roman" w:eastAsia="Times New Roman"/>
+          <w:b/>
+          <w:color w:val="000000"/>
+          <w:sz w:val="28"/>
+        </w:rPr>
         <w:t>1. Архітектура та місце backend у проєкті</w:t>
       </w:r>
     </w:p>
     <w:p>
+      <w:pPr>
+        <w:spacing w:line="360" w:lineRule="auto"/>
+        <w:jc w:val="both"/>
+      </w:pPr>
       <w:r>
+        <w:rPr>
+          <w:rFonts w:ascii="Times New Roman" w:hAnsi="Times New Roman" w:eastAsia="Times New Roman"/>
+          <w:sz w:val="28"/>
+        </w:rPr>
         <w:t>Сервер реалізований як монолітний REST API з чітким поділом відповідальностей. Next.js викликає API через JSON та передає Bearer JWT. Маршрутизатори перевіряють вхідні дані та права, сервіси виконують правила предметної області, репозиторії працюють із PostgreSQL через параметризовані SQL-запити SQLAlchemy. Схема і початкові дані беруться з лабораторної № 5.</w:t>
       </w:r>
     </w:p>
     <w:p>
+      <w:pPr>
+        <w:spacing w:line="360" w:lineRule="auto"/>
+      </w:pPr>
       <w:r>
+        <w:rPr>
+          <w:rFonts w:ascii="Times New Roman" w:hAnsi="Times New Roman" w:eastAsia="Times New Roman"/>
+          <w:sz w:val="28"/>
+        </w:rPr>
         <w:drawing>
           <wp:inline xmlns:a="http://schemas.openxmlformats.org/drawingml/2006/main" xmlns:pic="http://schemas.openxmlformats.org/drawingml/2006/picture">
             <wp:extent cx="6263640" cy="2046122"/>
@@ -217,14 +322,16 @@
     </w:p>
     <w:p>
       <w:pPr>
-        <w:spacing w:before="40" w:after="160"/>
+        <w:keepLines/>
+        <w:spacing w:before="40" w:after="160" w:line="240" w:lineRule="auto"/>
         <w:jc w:val="center"/>
       </w:pPr>
       <w:r>
         <w:rPr>
-          <w:i/>
-          <w:color w:val="5B6573"/>
-          <w:sz w:val="18"/>
+          <w:rFonts w:ascii="Times New Roman" w:hAnsi="Times New Roman" w:eastAsia="Times New Roman"/>
+          <w:i w:val="0"/>
+          <w:color w:val="000000"/>
+          <w:sz w:val="22"/>
         </w:rPr>
         <w:t>Рисунок 1 – Узгоджена архітектура наявного продукту</w:t>
       </w:r>
@@ -233,125 +340,236 @@
       <w:pPr>
         <w:pStyle w:val="Heading1"/>
         <w:keepNext/>
+        <w:spacing w:line="360" w:lineRule="auto" w:before="280" w:after="160"/>
+        <w:jc w:val="left"/>
       </w:pPr>
       <w:r>
+        <w:rPr>
+          <w:rFonts w:ascii="Times New Roman" w:hAnsi="Times New Roman" w:eastAsia="Times New Roman"/>
+          <w:b/>
+          <w:color w:val="000000"/>
+          <w:sz w:val="28"/>
+        </w:rPr>
         <w:t>2. Структура реалізації</w:t>
       </w:r>
     </w:p>
     <w:p>
+      <w:pPr>
+        <w:spacing w:line="360" w:lineRule="auto"/>
+        <w:jc w:val="both"/>
+      </w:pPr>
       <w:r>
-        <w:t>Backend винесено в окремий каталог lab8_10_backend. У спільному Docker Compose збережено наявний сервіс PostgreSQL і додано API; frontend збирається тим самим файлом конфігурації. Розширення для збереження активного стану таймера встановлюється ідемпотентно, тож працює також із вже ініціалізованим томом бази.</w:t>
+        <w:rPr>
+          <w:rFonts w:ascii="Times New Roman" w:hAnsi="Times New Roman" w:eastAsia="Times New Roman"/>
+          <w:sz w:val="28"/>
+        </w:rPr>
+        <w:t>Backend розміщено в lab8_10_backend разом з окремим docker-compose.yml. Compose збирає frontend із lab6_frontend, але ізолює сервіси, мережу й том бази цього стенду від лабораторної №5. SQL-схема та seed-дані монтуються в новий контейнер PostgreSQL лише для першої ініціалізації.</w:t>
       </w:r>
     </w:p>
     <w:p>
       <w:pPr>
         <w:pStyle w:val="Code"/>
+        <w:keepNext/>
+        <w:keepLines/>
+        <w:spacing w:line="240" w:lineRule="auto" w:after="0"/>
       </w:pPr>
       <w:r>
+        <w:rPr>
+          <w:rFonts w:ascii="Consolas" w:hAnsi="Consolas" w:eastAsia="Consolas"/>
+          <w:sz w:val="19"/>
+        </w:rPr>
         <w:t>lab8_10_backend/</w:t>
       </w:r>
     </w:p>
     <w:p>
       <w:pPr>
         <w:pStyle w:val="Code"/>
+        <w:keepNext/>
+        <w:keepLines/>
+        <w:spacing w:line="240" w:lineRule="auto" w:after="0"/>
       </w:pPr>
       <w:r>
+        <w:rPr>
+          <w:rFonts w:ascii="Consolas" w:hAnsi="Consolas" w:eastAsia="Consolas"/>
+          <w:sz w:val="19"/>
+        </w:rPr>
         <w:t>├── app/</w:t>
       </w:r>
     </w:p>
     <w:p>
       <w:pPr>
         <w:pStyle w:val="Code"/>
+        <w:keepNext/>
+        <w:keepLines/>
+        <w:spacing w:line="240" w:lineRule="auto" w:after="0"/>
       </w:pPr>
       <w:r>
+        <w:rPr>
+          <w:rFonts w:ascii="Consolas" w:hAnsi="Consolas" w:eastAsia="Consolas"/>
+          <w:sz w:val="19"/>
+        </w:rPr>
         <w:t>│   ├── core/          # конфігурація, БД, JWT, формат помилок</w:t>
       </w:r>
     </w:p>
     <w:p>
       <w:pPr>
         <w:pStyle w:val="Code"/>
+        <w:keepNext/>
+        <w:keepLines/>
+        <w:spacing w:line="240" w:lineRule="auto" w:after="0"/>
       </w:pPr>
       <w:r>
+        <w:rPr>
+          <w:rFonts w:ascii="Consolas" w:hAnsi="Consolas" w:eastAsia="Consolas"/>
+          <w:sz w:val="19"/>
+        </w:rPr>
         <w:t>│   ├── routers/       # HTTP-маршрути та перевірки ролей</w:t>
       </w:r>
     </w:p>
     <w:p>
       <w:pPr>
         <w:pStyle w:val="Code"/>
+        <w:keepNext/>
+        <w:keepLines/>
+        <w:spacing w:line="240" w:lineRule="auto" w:after="0"/>
       </w:pPr>
       <w:r>
+        <w:rPr>
+          <w:rFonts w:ascii="Consolas" w:hAnsi="Consolas" w:eastAsia="Consolas"/>
+          <w:sz w:val="19"/>
+        </w:rPr>
         <w:t>│   ├── schemas/       # валідація запитів і форматів даних</w:t>
       </w:r>
     </w:p>
     <w:p>
       <w:pPr>
         <w:pStyle w:val="Code"/>
+        <w:keepNext/>
+        <w:keepLines/>
+        <w:spacing w:line="240" w:lineRule="auto" w:after="0"/>
       </w:pPr>
       <w:r>
+        <w:rPr>
+          <w:rFonts w:ascii="Consolas" w:hAnsi="Consolas" w:eastAsia="Consolas"/>
+          <w:sz w:val="19"/>
+        </w:rPr>
         <w:t>│   ├── services/      # правила обліку часу та проєктів</w:t>
       </w:r>
     </w:p>
     <w:p>
       <w:pPr>
         <w:pStyle w:val="Code"/>
+        <w:keepNext/>
+        <w:keepLines/>
+        <w:spacing w:line="240" w:lineRule="auto" w:after="0"/>
       </w:pPr>
       <w:r>
+        <w:rPr>
+          <w:rFonts w:ascii="Consolas" w:hAnsi="Consolas" w:eastAsia="Consolas"/>
+          <w:sz w:val="19"/>
+        </w:rPr>
         <w:t>│   ├── repositories/  # запити й доступ до даних</w:t>
       </w:r>
     </w:p>
     <w:p>
       <w:pPr>
         <w:pStyle w:val="Code"/>
+        <w:keepNext/>
+        <w:keepLines/>
+        <w:spacing w:line="240" w:lineRule="auto" w:after="0"/>
       </w:pPr>
       <w:r>
+        <w:rPr>
+          <w:rFonts w:ascii="Consolas" w:hAnsi="Consolas" w:eastAsia="Consolas"/>
+          <w:sz w:val="19"/>
+        </w:rPr>
         <w:t>│   ├── dependencies.py</w:t>
       </w:r>
     </w:p>
     <w:p>
       <w:pPr>
         <w:pStyle w:val="Code"/>
+        <w:keepNext/>
+        <w:keepLines/>
+        <w:spacing w:line="240" w:lineRule="auto" w:after="0"/>
       </w:pPr>
       <w:r>
+        <w:rPr>
+          <w:rFonts w:ascii="Consolas" w:hAnsi="Consolas" w:eastAsia="Consolas"/>
+          <w:sz w:val="19"/>
+        </w:rPr>
         <w:t>│   └── main.py</w:t>
       </w:r>
     </w:p>
     <w:p>
       <w:pPr>
         <w:pStyle w:val="Code"/>
+        <w:keepNext/>
+        <w:keepLines/>
+        <w:spacing w:line="240" w:lineRule="auto" w:after="0"/>
       </w:pPr>
       <w:r>
-        <w:t>├── sql/               # сумісні розширення для схеми Lab 5</w:t>
+        <w:t>├── sql/</w:t>
+        <w:br/>
+        <w:t>│   └── 03_backend_extensions.sql</w:t>
       </w:r>
     </w:p>
     <w:p>
       <w:pPr>
         <w:pStyle w:val="Code"/>
+        <w:keepNext/>
+        <w:keepLines/>
+        <w:spacing w:line="240" w:lineRule="auto" w:after="0"/>
       </w:pPr>
       <w:r>
+        <w:rPr>
+          <w:rFonts w:ascii="Consolas" w:hAnsi="Consolas" w:eastAsia="Consolas"/>
+          <w:sz w:val="19"/>
+        </w:rPr>
         <w:t>├── screenshots/</w:t>
       </w:r>
     </w:p>
     <w:p>
       <w:pPr>
         <w:pStyle w:val="Code"/>
+        <w:keepNext/>
+        <w:keepLines/>
+        <w:spacing w:line="240" w:lineRule="auto" w:after="0"/>
       </w:pPr>
       <w:r>
+        <w:rPr>
+          <w:rFonts w:ascii="Consolas" w:hAnsi="Consolas" w:eastAsia="Consolas"/>
+          <w:sz w:val="19"/>
+        </w:rPr>
         <w:t>├── Dockerfile</w:t>
       </w:r>
     </w:p>
     <w:p>
       <w:pPr>
         <w:pStyle w:val="Code"/>
+        <w:keepNext/>
+        <w:keepLines/>
+        <w:spacing w:line="240" w:lineRule="auto" w:after="0"/>
       </w:pPr>
       <w:r>
+        <w:rPr>
+          <w:rFonts w:ascii="Consolas" w:hAnsi="Consolas" w:eastAsia="Consolas"/>
+          <w:sz w:val="19"/>
+        </w:rPr>
         <w:t>├── requirements.txt</w:t>
       </w:r>
     </w:p>
     <w:p>
       <w:pPr>
         <w:pStyle w:val="Code"/>
+        <w:keepLines/>
+        <w:spacing w:line="240" w:lineRule="auto" w:after="0"/>
       </w:pPr>
       <w:r>
+        <w:rPr>
+          <w:rFonts w:ascii="Consolas" w:hAnsi="Consolas" w:eastAsia="Consolas"/>
+          <w:sz w:val="19"/>
+        </w:rPr>
         <w:t>└── .env.example</w:t>
       </w:r>
     </w:p>
@@ -359,14 +577,45 @@
       <w:pPr>
         <w:pStyle w:val="Heading1"/>
         <w:keepNext/>
+        <w:spacing w:line="360" w:lineRule="auto" w:before="280" w:after="160"/>
+        <w:jc w:val="left"/>
       </w:pPr>
       <w:r>
+        <w:rPr>
+          <w:rFonts w:ascii="Times New Roman" w:hAnsi="Times New Roman" w:eastAsia="Times New Roman"/>
+          <w:b/>
+          <w:color w:val="000000"/>
+          <w:sz w:val="28"/>
+        </w:rPr>
         <w:t>3. Реалізовані API-сценарії</w:t>
       </w:r>
     </w:p>
     <w:p>
+      <w:pPr>
+        <w:spacing w:line="360" w:lineRule="auto"/>
+        <w:jc w:val="both"/>
+      </w:pPr>
       <w:r>
+        <w:rPr>
+          <w:rFonts w:ascii="Times New Roman" w:hAnsi="Times New Roman" w:eastAsia="Times New Roman"/>
+          <w:sz w:val="28"/>
+        </w:rPr>
         <w:t>API покриває користувацькі сценарії, закладені у фронтенді та API_CONTRACT.md. Дані про працівників, ролі, проєкти, завдання, заявки та облік часу читаються з наявних таблиць; основні зміни проходять перевірку бізнес-правил і запис аудиту.</w:t>
+      </w:r>
+    </w:p>
+    <w:p>
+      <w:pPr>
+        <w:keepNext/>
+        <w:pageBreakBefore/>
+        <w:spacing w:before="160" w:after="80"/>
+        <w:jc w:val="left"/>
+      </w:pPr>
+      <w:r>
+        <w:rPr>
+          <w:rFonts w:ascii="Times New Roman" w:hAnsi="Times New Roman" w:eastAsia="Times New Roman"/>
+          <w:sz w:val="24"/>
+        </w:rPr>
+        <w:t>Таблиця 1 – Основні групи REST API</w:t>
       </w:r>
     </w:p>
     <w:tbl>
@@ -374,6 +623,7 @@
         <w:tblStyle w:val="TableGrid"/>
         <w:tblW w:type="auto" w:w="0"/>
         <w:jc w:val="center"/>
+        <w:tblLayout w:type="fixed"/>
         <w:tblLook w:firstColumn="1" w:firstRow="1" w:lastColumn="0" w:lastRow="0" w:noHBand="0" w:noVBand="1" w:val="04A0"/>
       </w:tblPr>
       <w:tblGrid>
@@ -381,9 +631,13 @@
         <w:gridCol w:w="4939"/>
       </w:tblGrid>
       <w:tr>
+        <w:trPr>
+          <w:tblHeader w:val="true"/>
+          <w:cantSplit/>
+        </w:trPr>
         <w:tc>
           <w:tcPr>
-            <w:tcW w:type="dxa" w:w="2376"/>
+            <w:tcW w:type="dxa" w:w="2520"/>
             <w:shd w:fill="17365D"/>
             <w:vAlign w:val="center"/>
             <w:tcMar>
@@ -394,11 +648,16 @@
             </w:tcMar>
           </w:tcPr>
           <w:p>
+            <w:pPr>
+              <w:spacing w:line="276" w:lineRule="auto" w:after="40"/>
+              <w:jc w:val="left"/>
+            </w:pPr>
             <w:r>
               <w:rPr>
+                <w:rFonts w:ascii="Times New Roman" w:hAnsi="Times New Roman" w:eastAsia="Times New Roman"/>
                 <w:b/>
                 <w:color w:val="FFFFFF"/>
-                <w:sz w:val="18"/>
+                <w:sz w:val="22"/>
               </w:rPr>
               <w:t>Група маршрутів</w:t>
             </w:r>
@@ -406,7 +665,7 @@
         </w:tc>
         <w:tc>
           <w:tcPr>
-            <w:tcW w:type="dxa" w:w="7344"/>
+            <w:tcW w:type="dxa" w:w="6552"/>
             <w:shd w:fill="17365D"/>
             <w:vAlign w:val="center"/>
             <w:tcMar>
@@ -417,11 +676,16 @@
             </w:tcMar>
           </w:tcPr>
           <w:p>
+            <w:pPr>
+              <w:spacing w:line="276" w:lineRule="auto" w:after="40"/>
+              <w:jc w:val="left"/>
+            </w:pPr>
             <w:r>
               <w:rPr>
+                <w:rFonts w:ascii="Times New Roman" w:hAnsi="Times New Roman" w:eastAsia="Times New Roman"/>
                 <w:b/>
                 <w:color w:val="FFFFFF"/>
-                <w:sz w:val="18"/>
+                <w:sz w:val="22"/>
               </w:rPr>
               <w:t>Реалізована поведінка</w:t>
             </w:r>
@@ -429,9 +693,12 @@
         </w:tc>
       </w:tr>
       <w:tr>
+        <w:trPr>
+          <w:cantSplit/>
+        </w:trPr>
         <w:tc>
           <w:tcPr>
-            <w:tcW w:type="dxa" w:w="2376"/>
+            <w:tcW w:type="dxa" w:w="2520"/>
             <w:vAlign w:val="center"/>
             <w:tcMar>
               <w:top w:w="100" w:type="dxa"/>
@@ -442,11 +709,13 @@
           </w:tcPr>
           <w:p>
             <w:pPr>
-              <w:spacing w:after="20"/>
+              <w:spacing w:after="40" w:line="276" w:lineRule="auto"/>
+              <w:jc w:val="left"/>
             </w:pPr>
             <w:r>
               <w:rPr>
-                <w:sz w:val="18"/>
+                <w:rFonts w:ascii="Times New Roman" w:hAnsi="Times New Roman" w:eastAsia="Times New Roman"/>
+                <w:sz w:val="22"/>
               </w:rPr>
               <w:t>Автентифікація</w:t>
             </w:r>
@@ -454,7 +723,7 @@
         </w:tc>
         <w:tc>
           <w:tcPr>
-            <w:tcW w:type="dxa" w:w="7344"/>
+            <w:tcW w:type="dxa" w:w="6552"/>
             <w:vAlign w:val="center"/>
             <w:tcMar>
               <w:top w:w="100" w:type="dxa"/>
@@ -465,11 +734,13 @@
           </w:tcPr>
           <w:p>
             <w:pPr>
-              <w:spacing w:after="20"/>
+              <w:spacing w:after="40" w:line="276" w:lineRule="auto"/>
+              <w:jc w:val="left"/>
             </w:pPr>
             <w:r>
               <w:rPr>
-                <w:sz w:val="18"/>
+                <w:rFonts w:ascii="Times New Roman" w:hAnsi="Times New Roman" w:eastAsia="Times New Roman"/>
+                <w:sz w:val="22"/>
               </w:rPr>
               <w:t>Вхід, профіль поточного користувача, зміна пароля, перелік демонстраційних облікових записів.</w:t>
             </w:r>
@@ -477,9 +748,12 @@
         </w:tc>
       </w:tr>
       <w:tr>
+        <w:trPr>
+          <w:cantSplit/>
+        </w:trPr>
         <w:tc>
           <w:tcPr>
-            <w:tcW w:type="dxa" w:w="2376"/>
+            <w:tcW w:type="dxa" w:w="2520"/>
             <w:vAlign w:val="center"/>
             <w:tcMar>
               <w:top w:w="100" w:type="dxa"/>
@@ -491,11 +765,13 @@
           </w:tcPr>
           <w:p>
             <w:pPr>
-              <w:spacing w:after="20"/>
+              <w:spacing w:after="40" w:line="276" w:lineRule="auto"/>
+              <w:jc w:val="left"/>
             </w:pPr>
             <w:r>
               <w:rPr>
-                <w:sz w:val="18"/>
+                <w:rFonts w:ascii="Times New Roman" w:hAnsi="Times New Roman" w:eastAsia="Times New Roman"/>
+                <w:sz w:val="22"/>
               </w:rPr>
               <w:t>Облік часу</w:t>
             </w:r>
@@ -503,7 +779,7 @@
         </w:tc>
         <w:tc>
           <w:tcPr>
-            <w:tcW w:type="dxa" w:w="7344"/>
+            <w:tcW w:type="dxa" w:w="6552"/>
             <w:vAlign w:val="center"/>
             <w:tcMar>
               <w:top w:w="100" w:type="dxa"/>
@@ -515,11 +791,13 @@
           </w:tcPr>
           <w:p>
             <w:pPr>
-              <w:spacing w:after="20"/>
+              <w:spacing w:after="40" w:line="276" w:lineRule="auto"/>
+              <w:jc w:val="left"/>
             </w:pPr>
             <w:r>
               <w:rPr>
-                <w:sz w:val="18"/>
+                <w:rFonts w:ascii="Times New Roman" w:hAnsi="Times New Roman" w:eastAsia="Times New Roman"/>
+                <w:sz w:val="22"/>
               </w:rPr>
               <w:t>Стан таймера, старт/пауза/відновлення, обід, завершення зміни, ручні записи та їх редагування.</w:t>
             </w:r>
@@ -527,9 +805,12 @@
         </w:tc>
       </w:tr>
       <w:tr>
+        <w:trPr>
+          <w:cantSplit/>
+        </w:trPr>
         <w:tc>
           <w:tcPr>
-            <w:tcW w:type="dxa" w:w="2376"/>
+            <w:tcW w:type="dxa" w:w="2520"/>
             <w:vAlign w:val="center"/>
             <w:tcMar>
               <w:top w:w="100" w:type="dxa"/>
@@ -540,11 +821,13 @@
           </w:tcPr>
           <w:p>
             <w:pPr>
-              <w:spacing w:after="20"/>
+              <w:spacing w:after="40" w:line="276" w:lineRule="auto"/>
+              <w:jc w:val="left"/>
             </w:pPr>
             <w:r>
               <w:rPr>
-                <w:sz w:val="18"/>
+                <w:rFonts w:ascii="Times New Roman" w:hAnsi="Times New Roman" w:eastAsia="Times New Roman"/>
+                <w:sz w:val="22"/>
               </w:rPr>
               <w:t>Проєкти та завдання</w:t>
             </w:r>
@@ -552,7 +835,7 @@
         </w:tc>
         <w:tc>
           <w:tcPr>
-            <w:tcW w:type="dxa" w:w="7344"/>
+            <w:tcW w:type="dxa" w:w="6552"/>
             <w:vAlign w:val="center"/>
             <w:tcMar>
               <w:top w:w="100" w:type="dxa"/>
@@ -563,11 +846,13 @@
           </w:tcPr>
           <w:p>
             <w:pPr>
-              <w:spacing w:after="20"/>
+              <w:spacing w:after="40" w:line="276" w:lineRule="auto"/>
+              <w:jc w:val="left"/>
             </w:pPr>
             <w:r>
               <w:rPr>
-                <w:sz w:val="18"/>
+                <w:rFonts w:ascii="Times New Roman" w:hAnsi="Times New Roman" w:eastAsia="Times New Roman"/>
+                <w:sz w:val="22"/>
               </w:rPr>
               <w:t>Список і деталі проєктів, створення/оновлення, перелік задач, зміна статусу й пріоритету.</w:t>
             </w:r>
@@ -575,9 +860,12 @@
         </w:tc>
       </w:tr>
       <w:tr>
+        <w:trPr>
+          <w:cantSplit/>
+        </w:trPr>
         <w:tc>
           <w:tcPr>
-            <w:tcW w:type="dxa" w:w="2376"/>
+            <w:tcW w:type="dxa" w:w="2520"/>
             <w:vAlign w:val="center"/>
             <w:tcMar>
               <w:top w:w="100" w:type="dxa"/>
@@ -589,11 +877,13 @@
           </w:tcPr>
           <w:p>
             <w:pPr>
-              <w:spacing w:after="20"/>
+              <w:spacing w:after="40" w:line="276" w:lineRule="auto"/>
+              <w:jc w:val="left"/>
             </w:pPr>
             <w:r>
               <w:rPr>
-                <w:sz w:val="18"/>
+                <w:rFonts w:ascii="Times New Roman" w:hAnsi="Times New Roman" w:eastAsia="Times New Roman"/>
+                <w:sz w:val="22"/>
               </w:rPr>
               <w:t>Команда та відсутність</w:t>
             </w:r>
@@ -601,7 +891,7 @@
         </w:tc>
         <w:tc>
           <w:tcPr>
-            <w:tcW w:type="dxa" w:w="7344"/>
+            <w:tcW w:type="dxa" w:w="6552"/>
             <w:vAlign w:val="center"/>
             <w:tcMar>
               <w:top w:w="100" w:type="dxa"/>
@@ -613,11 +903,13 @@
           </w:tcPr>
           <w:p>
             <w:pPr>
-              <w:spacing w:after="20"/>
+              <w:spacing w:after="40" w:line="276" w:lineRule="auto"/>
+              <w:jc w:val="left"/>
             </w:pPr>
             <w:r>
               <w:rPr>
-                <w:sz w:val="18"/>
+                <w:rFonts w:ascii="Times New Roman" w:hAnsi="Times New Roman" w:eastAsia="Times New Roman"/>
+                <w:sz w:val="22"/>
               </w:rPr>
               <w:t>Список працівників і ставок, заявки на відпустку, узгодження, розклад команди.</w:t>
             </w:r>
@@ -625,9 +917,12 @@
         </w:tc>
       </w:tr>
       <w:tr>
+        <w:trPr>
+          <w:cantSplit/>
+        </w:trPr>
         <w:tc>
           <w:tcPr>
-            <w:tcW w:type="dxa" w:w="2376"/>
+            <w:tcW w:type="dxa" w:w="2520"/>
             <w:vAlign w:val="center"/>
             <w:tcMar>
               <w:top w:w="100" w:type="dxa"/>
@@ -638,11 +933,13 @@
           </w:tcPr>
           <w:p>
             <w:pPr>
-              <w:spacing w:after="20"/>
+              <w:spacing w:after="40" w:line="276" w:lineRule="auto"/>
+              <w:jc w:val="left"/>
             </w:pPr>
             <w:r>
               <w:rPr>
-                <w:sz w:val="18"/>
+                <w:rFonts w:ascii="Times New Roman" w:hAnsi="Times New Roman" w:eastAsia="Times New Roman"/>
+                <w:sz w:val="22"/>
               </w:rPr>
               <w:t>Звіти та аналітика</w:t>
             </w:r>
@@ -650,7 +947,7 @@
         </w:tc>
         <w:tc>
           <w:tcPr>
-            <w:tcW w:type="dxa" w:w="7344"/>
+            <w:tcW w:type="dxa" w:w="6552"/>
             <w:vAlign w:val="center"/>
             <w:tcMar>
               <w:top w:w="100" w:type="dxa"/>
@@ -661,11 +958,13 @@
           </w:tcPr>
           <w:p>
             <w:pPr>
-              <w:spacing w:after="20"/>
+              <w:spacing w:after="40" w:line="276" w:lineRule="auto"/>
+              <w:jc w:val="left"/>
             </w:pPr>
             <w:r>
               <w:rPr>
-                <w:sz w:val="18"/>
+                <w:rFonts w:ascii="Times New Roman" w:hAnsi="Times New Roman" w:eastAsia="Times New Roman"/>
+                <w:sz w:val="22"/>
               </w:rPr>
               <w:t>Звіти, підсумки робочого часу, запізнення, витрати та показники по проєктах.</w:t>
             </w:r>
@@ -673,9 +972,12 @@
         </w:tc>
       </w:tr>
       <w:tr>
+        <w:trPr>
+          <w:cantSplit/>
+        </w:trPr>
         <w:tc>
           <w:tcPr>
-            <w:tcW w:type="dxa" w:w="2376"/>
+            <w:tcW w:type="dxa" w:w="2520"/>
             <w:vAlign w:val="center"/>
             <w:tcMar>
               <w:top w:w="100" w:type="dxa"/>
@@ -687,11 +989,13 @@
           </w:tcPr>
           <w:p>
             <w:pPr>
-              <w:spacing w:after="20"/>
+              <w:spacing w:after="40" w:line="276" w:lineRule="auto"/>
+              <w:jc w:val="left"/>
             </w:pPr>
             <w:r>
               <w:rPr>
-                <w:sz w:val="18"/>
+                <w:rFonts w:ascii="Times New Roman" w:hAnsi="Times New Roman" w:eastAsia="Times New Roman"/>
+                <w:sz w:val="22"/>
               </w:rPr>
               <w:t>Сповіщення та оплата</w:t>
             </w:r>
@@ -699,7 +1003,7 @@
         </w:tc>
         <w:tc>
           <w:tcPr>
-            <w:tcW w:type="dxa" w:w="7344"/>
+            <w:tcW w:type="dxa" w:w="6552"/>
             <w:vAlign w:val="center"/>
             <w:tcMar>
               <w:top w:w="100" w:type="dxa"/>
@@ -711,11 +1015,13 @@
           </w:tcPr>
           <w:p>
             <w:pPr>
-              <w:spacing w:after="20"/>
+              <w:spacing w:after="40" w:line="276" w:lineRule="auto"/>
+              <w:jc w:val="left"/>
             </w:pPr>
             <w:r>
               <w:rPr>
-                <w:sz w:val="18"/>
+                <w:rFonts w:ascii="Times New Roman" w:hAnsi="Times New Roman" w:eastAsia="Times New Roman"/>
+                <w:sz w:val="22"/>
               </w:rPr>
               <w:t>Список і прочитання сповіщень, розрахункові рядки й витрати за проєктами.</w:t>
             </w:r>
@@ -725,11 +1031,19 @@
     </w:tbl>
     <w:p>
       <w:pPr>
-        <w:spacing w:after="0"/>
+        <w:spacing w:after="0" w:line="360" w:lineRule="auto"/>
       </w:pPr>
     </w:p>
     <w:p>
+      <w:pPr>
+        <w:spacing w:line="360" w:lineRule="auto"/>
+        <w:jc w:val="both"/>
+      </w:pPr>
       <w:r>
+        <w:rPr>
+          <w:rFonts w:ascii="Times New Roman" w:hAnsi="Times New Roman" w:eastAsia="Times New Roman"/>
+          <w:sz w:val="28"/>
+        </w:rPr>
         <w:t>Документація OpenAPI доступна за адресою /docs. API повертає JSON; помилки мають HTTP-статус і зрозуміле повідомлення. Для конфліктів унікальності та посилальної цілісності помилки бази перетворюються у клієнтську відповідь, а не залишаються необробленою трасою.</w:t>
       </w:r>
     </w:p>
@@ -737,87 +1051,177 @@
       <w:pPr>
         <w:pStyle w:val="Heading1"/>
         <w:keepNext/>
+        <w:pageBreakBefore w:val="0"/>
+        <w:spacing w:line="360" w:lineRule="auto" w:before="280" w:after="160"/>
+        <w:jc w:val="left"/>
       </w:pPr>
       <w:r>
+        <w:rPr>
+          <w:rFonts w:ascii="Times New Roman" w:hAnsi="Times New Roman" w:eastAsia="Times New Roman"/>
+          <w:b/>
+          <w:color w:val="000000"/>
+          <w:sz w:val="28"/>
+        </w:rPr>
         <w:t>4. Автентифікація, авторизація та цілісність</w:t>
       </w:r>
     </w:p>
     <w:p>
+      <w:pPr>
+        <w:spacing w:line="360" w:lineRule="auto"/>
+        <w:jc w:val="both"/>
+      </w:pPr>
       <w:r>
+        <w:rPr>
+          <w:rFonts w:ascii="Times New Roman" w:hAnsi="Times New Roman" w:eastAsia="Times New Roman"/>
+          <w:sz w:val="28"/>
+        </w:rPr>
         <w:t>Після успішного входу backend повертає JWT, який frontend зберігає для API-запитів. Захищені маршрути перевіряють підпис, термін дії та активність користувача. Паролі зберігаються як Argon2-хеші; пароль демонстраційних користувачів первинних лабораторних замінюється на першому старті контейнера. Секрет JWT та параметри підключення конфігуруються через змінні середовища.</w:t>
       </w:r>
     </w:p>
     <w:p>
+      <w:pPr>
+        <w:keepLines/>
+        <w:spacing w:line="360" w:lineRule="auto"/>
+        <w:jc w:val="both"/>
+      </w:pPr>
       <w:r>
+        <w:rPr>
+          <w:rFonts w:ascii="Times New Roman" w:hAnsi="Times New Roman" w:eastAsia="Times New Roman"/>
+          <w:sz w:val="28"/>
+        </w:rPr>
         <w:t>Рольова модель застосовує ті самі ролі продукту. Наприклад, працівник бачить власні записи часу та не може отримати загальний список команди; доступ до зарплатних даних, ставок і витрат обмежено фінансовими ролями. Керівник обмежений своїм відділом. Перевірка виконується сервером незалежно від того, що показує інтерфейс.</w:t>
       </w:r>
     </w:p>
     <w:p>
       <w:pPr>
         <w:pStyle w:val="Code"/>
+        <w:keepNext/>
+        <w:keepLines/>
+        <w:pageBreakBefore w:val="0"/>
+        <w:spacing w:line="240" w:lineRule="auto" w:after="0"/>
       </w:pPr>
       <w:r>
+        <w:rPr>
+          <w:rFonts w:ascii="Consolas" w:hAnsi="Consolas" w:eastAsia="Consolas"/>
+          <w:sz w:val="19"/>
+        </w:rPr>
         <w:t># Приклад залежності захищеного маршруту</w:t>
       </w:r>
     </w:p>
     <w:p>
       <w:pPr>
         <w:pStyle w:val="Code"/>
+        <w:keepNext/>
+        <w:keepLines/>
+        <w:spacing w:line="240" w:lineRule="auto" w:after="0"/>
       </w:pPr>
       <w:r>
+        <w:rPr>
+          <w:rFonts w:ascii="Consolas" w:hAnsi="Consolas" w:eastAsia="Consolas"/>
+          <w:sz w:val="19"/>
+        </w:rPr>
         <w:t>@router.get("/me")</w:t>
       </w:r>
     </w:p>
     <w:p>
       <w:pPr>
         <w:pStyle w:val="Code"/>
+        <w:keepNext/>
+        <w:keepLines/>
+        <w:spacing w:line="240" w:lineRule="auto" w:after="0"/>
       </w:pPr>
       <w:r>
+        <w:rPr>
+          <w:rFonts w:ascii="Consolas" w:hAnsi="Consolas" w:eastAsia="Consolas"/>
+          <w:sz w:val="19"/>
+        </w:rPr>
         <w:t>def me(user: CurrentUser, db: DbSession):</w:t>
       </w:r>
     </w:p>
     <w:p>
       <w:pPr>
         <w:pStyle w:val="Code"/>
+        <w:keepNext/>
+        <w:keepLines/>
+        <w:spacing w:line="240" w:lineRule="auto" w:after="0"/>
       </w:pPr>
       <w:r>
+        <w:rPr>
+          <w:rFonts w:ascii="Consolas" w:hAnsi="Consolas" w:eastAsia="Consolas"/>
+          <w:sz w:val="19"/>
+        </w:rPr>
         <w:t xml:space="preserve">    row = db.execute(</w:t>
       </w:r>
     </w:p>
     <w:p>
       <w:pPr>
         <w:pStyle w:val="Code"/>
+        <w:keepNext/>
+        <w:keepLines/>
+        <w:spacing w:line="240" w:lineRule="auto" w:after="0"/>
       </w:pPr>
       <w:r>
+        <w:rPr>
+          <w:rFonts w:ascii="Consolas" w:hAnsi="Consolas" w:eastAsia="Consolas"/>
+          <w:sz w:val="19"/>
+        </w:rPr>
         <w:t xml:space="preserve">        text("SELECT id,email,full_name,role FROM users WHERE id=:id"),</w:t>
       </w:r>
     </w:p>
     <w:p>
       <w:pPr>
         <w:pStyle w:val="Code"/>
+        <w:keepNext/>
+        <w:keepLines/>
+        <w:spacing w:line="240" w:lineRule="auto" w:after="0"/>
       </w:pPr>
       <w:r>
+        <w:rPr>
+          <w:rFonts w:ascii="Consolas" w:hAnsi="Consolas" w:eastAsia="Consolas"/>
+          <w:sz w:val="19"/>
+        </w:rPr>
         <w:t xml:space="preserve">        {"id": user["id"]},</w:t>
       </w:r>
     </w:p>
     <w:p>
       <w:pPr>
         <w:pStyle w:val="Code"/>
+        <w:keepNext/>
+        <w:keepLines/>
+        <w:spacing w:line="240" w:lineRule="auto" w:after="0"/>
       </w:pPr>
       <w:r>
+        <w:rPr>
+          <w:rFonts w:ascii="Consolas" w:hAnsi="Consolas" w:eastAsia="Consolas"/>
+          <w:sz w:val="19"/>
+        </w:rPr>
         <w:t xml:space="preserve">    ).mappings().one()</w:t>
       </w:r>
     </w:p>
     <w:p>
       <w:pPr>
         <w:pStyle w:val="Code"/>
+        <w:keepLines/>
+        <w:spacing w:line="240" w:lineRule="auto" w:after="0"/>
       </w:pPr>
       <w:r>
+        <w:rPr>
+          <w:rFonts w:ascii="Consolas" w:hAnsi="Consolas" w:eastAsia="Consolas"/>
+          <w:sz w:val="19"/>
+        </w:rPr>
         <w:t xml:space="preserve">    return {"user": user_public(row)}</w:t>
       </w:r>
     </w:p>
     <w:p>
+      <w:pPr>
+        <w:spacing w:line="360" w:lineRule="auto"/>
+        <w:jc w:val="both"/>
+      </w:pPr>
       <w:r>
+        <w:rPr>
+          <w:rFonts w:ascii="Times New Roman" w:hAnsi="Times New Roman" w:eastAsia="Times New Roman"/>
+          <w:sz w:val="28"/>
+        </w:rPr>
         <w:t>Вхідні дані перевіряються Pydantic-схемами: формат електронної пошти, обов’язкові поля, допустимі діапазони і стани. SQL виконується з параметрами, а дозволені до оновлення поля формуються зі списку, визначеного сервером.</w:t>
       </w:r>
     </w:p>
@@ -825,81 +1229,115 @@
       <w:pPr>
         <w:pStyle w:val="Heading1"/>
         <w:keepNext/>
+        <w:pageBreakBefore w:val="0"/>
+        <w:spacing w:line="360" w:lineRule="auto" w:before="280" w:after="160"/>
+        <w:jc w:val="left"/>
       </w:pPr>
       <w:r>
+        <w:rPr>
+          <w:rFonts w:ascii="Times New Roman" w:hAnsi="Times New Roman" w:eastAsia="Times New Roman"/>
+          <w:b/>
+          <w:color w:val="000000"/>
+          <w:sz w:val="28"/>
+        </w:rPr>
         <w:t>5. Підключення frontend та запуск контейнерів</w:t>
       </w:r>
     </w:p>
     <w:p>
+      <w:pPr>
+        <w:spacing w:line="360" w:lineRule="auto"/>
+        <w:jc w:val="both"/>
+      </w:pPr>
       <w:r>
+        <w:rPr>
+          <w:rFonts w:ascii="Times New Roman" w:hAnsi="Times New Roman" w:eastAsia="Times New Roman"/>
+          <w:sz w:val="28"/>
+        </w:rPr>
         <w:t>Фронтенд більше не перемикає роль локально й не використовує демонстраційний Zustand як єдине джерело даних. Після входу він отримує JWT, завантажує профіль та синхронізує часові записи, проєкти, задачі, заявки, звіти, сповіщення і розклад із API. Кнопки таймера й редагування даних надсилають зміни backend. NEXT_PUBLIC_API_URL задається під час збірки контейнера.</w:t>
       </w:r>
     </w:p>
     <w:p>
       <w:pPr>
         <w:pStyle w:val="Code"/>
+        <w:keepLines/>
+        <w:spacing w:line="240" w:lineRule="auto" w:after="0"/>
       </w:pPr>
       <w:r>
-        <w:t>cd lab5</w:t>
+        <w:rPr>
+          <w:rFonts w:ascii="Consolas" w:hAnsi="Consolas" w:eastAsia="Consolas"/>
+          <w:sz w:val="19"/>
+        </w:rPr>
+        <w:t>cd lab8_10_backend</w:t>
+        <w:br/>
+        <w:t>docker compose up -d --build</w:t>
+        <w:br/>
+        <w:t># Web UI:  http://localhost:3101</w:t>
+        <w:br/>
+        <w:t># API:     http://localhost:8100/api</w:t>
+        <w:br/>
+        <w:t># Swagger: http://localhost:8100/docs</w:t>
+        <w:br/>
+        <w:t># Health:  http://localhost:8100/health</w:t>
+        <w:br/>
+        <w:t># DB:      localhost:5434</w:t>
       </w:r>
     </w:p>
     <w:p>
       <w:pPr>
-        <w:pStyle w:val="Code"/>
+        <w:spacing w:line="360" w:lineRule="auto"/>
+        <w:jc w:val="both"/>
       </w:pPr>
       <w:r>
-        <w:t>docker compose --env-file ../lab8_10_backend/.env.example up -d --build</w:t>
-      </w:r>
-    </w:p>
-    <w:p>
-      <w:pPr>
-        <w:pStyle w:val="Code"/>
-      </w:pPr>
-      <w:r>
-        <w:t># Web UI:  http://localhost:3100</w:t>
-      </w:r>
-    </w:p>
-    <w:p>
-      <w:pPr>
-        <w:pStyle w:val="Code"/>
-      </w:pPr>
-      <w:r>
-        <w:t># API:     http://localhost:8000/api</w:t>
-      </w:r>
-    </w:p>
-    <w:p>
-      <w:pPr>
-        <w:pStyle w:val="Code"/>
-      </w:pPr>
-      <w:r>
-        <w:t># Swagger: http://localhost:8000/docs</w:t>
-      </w:r>
-    </w:p>
-    <w:p>
-      <w:pPr>
-        <w:pStyle w:val="Code"/>
-      </w:pPr>
-      <w:r>
-        <w:t># Health:  http://localhost:8000/health</w:t>
-      </w:r>
-    </w:p>
-    <w:p>
-      <w:r>
-        <w:t>Compose запускає наявний PostgreSQL, FastAPI та Next.js, а також зберігає наявний pgAdmin. Backend очікує готовності бази; endpoint /health повертає стан сервера та підключення до PostgreSQL. Значення .env.example призначені для локального навчального запуску; для окремого середовища задаються власні значення секретів.</w:t>
+        <w:rPr>
+          <w:rFonts w:ascii="Times New Roman" w:hAnsi="Times New Roman" w:eastAsia="Times New Roman"/>
+          <w:sz w:val="28"/>
+        </w:rPr>
+        <w:t>Окремий Compose-проєкт запускає власні PostgreSQL, FastAPI та Next.js контейнери в окремій мережі й з окремим томом бази. Для створення схеми та початкових даних він повторно використовує SQL-файли лабораторної №5; запуск лабораторної №5 при цьому не потрібен. Параметри навчального входу описані у .env.example.</w:t>
       </w:r>
     </w:p>
     <w:p>
       <w:pPr>
         <w:pStyle w:val="Heading1"/>
         <w:keepNext/>
+        <w:pageBreakBefore/>
+        <w:spacing w:line="360" w:lineRule="auto" w:before="280" w:after="160"/>
+        <w:jc w:val="left"/>
       </w:pPr>
       <w:r>
+        <w:rPr>
+          <w:rFonts w:ascii="Times New Roman" w:hAnsi="Times New Roman" w:eastAsia="Times New Roman"/>
+          <w:b/>
+          <w:color w:val="000000"/>
+          <w:sz w:val="28"/>
+        </w:rPr>
         <w:t>6. Перевірка роботи</w:t>
       </w:r>
     </w:p>
     <w:p>
+      <w:pPr>
+        <w:spacing w:line="360" w:lineRule="auto"/>
+        <w:jc w:val="both"/>
+      </w:pPr>
       <w:r>
+        <w:rPr>
+          <w:rFonts w:ascii="Times New Roman" w:hAnsi="Times New Roman" w:eastAsia="Times New Roman"/>
+          <w:sz w:val="28"/>
+        </w:rPr>
         <w:t>Зібрано production-образи API і фронтенду та запущено їх поруч із наявною базою. Виконано запити до /health, автентифікацію адміністратора і працівника, читання профілю та прикладні GET-маршрути. Адміністративні й фінансові маршрути перевірені від імені адміністратора; працівнику відмовлено в доступі до загального списку команди (HTTP 403). База містила 12 проєктів, а адміністративний список повернув 18 користувачів на момент перевірки.</w:t>
+      </w:r>
+    </w:p>
+    <w:p>
+      <w:pPr>
+        <w:keepNext/>
+        <w:spacing w:before="160" w:after="80"/>
+        <w:jc w:val="left"/>
+      </w:pPr>
+      <w:r>
+        <w:rPr>
+          <w:rFonts w:ascii="Times New Roman" w:hAnsi="Times New Roman" w:eastAsia="Times New Roman"/>
+          <w:sz w:val="24"/>
+        </w:rPr>
+        <w:t>Таблиця 2 – Результати перевірки системи</w:t>
       </w:r>
     </w:p>
     <w:tbl>
@@ -907,6 +1345,7 @@
         <w:tblStyle w:val="TableGrid"/>
         <w:tblW w:type="auto" w:w="0"/>
         <w:jc w:val="center"/>
+        <w:tblLayout w:type="fixed"/>
         <w:tblLook w:firstColumn="1" w:firstRow="1" w:lastColumn="0" w:lastRow="0" w:noHBand="0" w:noVBand="1" w:val="04A0"/>
       </w:tblPr>
       <w:tblGrid>
@@ -914,9 +1353,13 @@
         <w:gridCol w:w="4939"/>
       </w:tblGrid>
       <w:tr>
+        <w:trPr>
+          <w:tblHeader w:val="true"/>
+          <w:cantSplit/>
+        </w:trPr>
         <w:tc>
           <w:tcPr>
-            <w:tcW w:type="dxa" w:w="3024"/>
+            <w:tcW w:type="dxa" w:w="2880"/>
             <w:shd w:fill="17365D"/>
             <w:vAlign w:val="center"/>
             <w:tcMar>
@@ -927,11 +1370,16 @@
             </w:tcMar>
           </w:tcPr>
           <w:p>
+            <w:pPr>
+              <w:spacing w:line="276" w:lineRule="auto" w:after="40"/>
+              <w:jc w:val="left"/>
+            </w:pPr>
             <w:r>
               <w:rPr>
+                <w:rFonts w:ascii="Times New Roman" w:hAnsi="Times New Roman" w:eastAsia="Times New Roman"/>
                 <w:b/>
                 <w:color w:val="FFFFFF"/>
-                <w:sz w:val="18"/>
+                <w:sz w:val="22"/>
               </w:rPr>
               <w:t>Перевірка</w:t>
             </w:r>
@@ -939,7 +1387,7 @@
         </w:tc>
         <w:tc>
           <w:tcPr>
-            <w:tcW w:type="dxa" w:w="6696"/>
+            <w:tcW w:type="dxa" w:w="6192"/>
             <w:shd w:fill="17365D"/>
             <w:vAlign w:val="center"/>
             <w:tcMar>
@@ -950,11 +1398,16 @@
             </w:tcMar>
           </w:tcPr>
           <w:p>
+            <w:pPr>
+              <w:spacing w:line="276" w:lineRule="auto" w:after="40"/>
+              <w:jc w:val="left"/>
+            </w:pPr>
             <w:r>
               <w:rPr>
+                <w:rFonts w:ascii="Times New Roman" w:hAnsi="Times New Roman" w:eastAsia="Times New Roman"/>
                 <w:b/>
                 <w:color w:val="FFFFFF"/>
-                <w:sz w:val="18"/>
+                <w:sz w:val="22"/>
               </w:rPr>
               <w:t>Результат</w:t>
             </w:r>
@@ -962,9 +1415,12 @@
         </w:tc>
       </w:tr>
       <w:tr>
+        <w:trPr>
+          <w:cantSplit/>
+        </w:trPr>
         <w:tc>
           <w:tcPr>
-            <w:tcW w:type="dxa" w:w="3024"/>
+            <w:tcW w:type="dxa" w:w="2880"/>
             <w:vAlign w:val="center"/>
             <w:tcMar>
               <w:top w:w="100" w:type="dxa"/>
@@ -975,11 +1431,13 @@
           </w:tcPr>
           <w:p>
             <w:pPr>
-              <w:spacing w:after="20"/>
+              <w:spacing w:after="40" w:line="276" w:lineRule="auto"/>
+              <w:jc w:val="left"/>
             </w:pPr>
             <w:r>
               <w:rPr>
-                <w:sz w:val="18"/>
+                <w:rFonts w:ascii="Times New Roman" w:hAnsi="Times New Roman" w:eastAsia="Times New Roman"/>
+                <w:sz w:val="22"/>
               </w:rPr>
               <w:t>Docker Compose build</w:t>
             </w:r>
@@ -987,7 +1445,7 @@
         </w:tc>
         <w:tc>
           <w:tcPr>
-            <w:tcW w:type="dxa" w:w="6696"/>
+            <w:tcW w:type="dxa" w:w="6192"/>
             <w:vAlign w:val="center"/>
             <w:tcMar>
               <w:top w:w="100" w:type="dxa"/>
@@ -998,11 +1456,13 @@
           </w:tcPr>
           <w:p>
             <w:pPr>
-              <w:spacing w:after="20"/>
+              <w:spacing w:after="40" w:line="276" w:lineRule="auto"/>
+              <w:jc w:val="left"/>
             </w:pPr>
             <w:r>
               <w:rPr>
-                <w:sz w:val="18"/>
+                <w:rFonts w:ascii="Times New Roman" w:hAnsi="Times New Roman" w:eastAsia="Times New Roman"/>
+                <w:sz w:val="22"/>
               </w:rPr>
               <w:t>Frontend Next.js production build і образ FastAPI зібрано; сервіси запущено.</w:t>
             </w:r>
@@ -1010,9 +1470,12 @@
         </w:tc>
       </w:tr>
       <w:tr>
+        <w:trPr>
+          <w:cantSplit/>
+        </w:trPr>
         <w:tc>
           <w:tcPr>
-            <w:tcW w:type="dxa" w:w="3024"/>
+            <w:tcW w:type="dxa" w:w="2880"/>
             <w:vAlign w:val="center"/>
             <w:tcMar>
               <w:top w:w="100" w:type="dxa"/>
@@ -1024,11 +1487,13 @@
           </w:tcPr>
           <w:p>
             <w:pPr>
-              <w:spacing w:after="20"/>
+              <w:spacing w:after="40" w:line="276" w:lineRule="auto"/>
+              <w:jc w:val="left"/>
             </w:pPr>
             <w:r>
               <w:rPr>
-                <w:sz w:val="18"/>
+                <w:rFonts w:ascii="Times New Roman" w:hAnsi="Times New Roman" w:eastAsia="Times New Roman"/>
+                <w:sz w:val="22"/>
               </w:rPr>
               <w:t>Підключення до БД</w:t>
             </w:r>
@@ -1036,7 +1501,7 @@
         </w:tc>
         <w:tc>
           <w:tcPr>
-            <w:tcW w:type="dxa" w:w="6696"/>
+            <w:tcW w:type="dxa" w:w="6192"/>
             <w:vAlign w:val="center"/>
             <w:tcMar>
               <w:top w:w="100" w:type="dxa"/>
@@ -1048,11 +1513,13 @@
           </w:tcPr>
           <w:p>
             <w:pPr>
-              <w:spacing w:after="20"/>
+              <w:spacing w:after="40" w:line="276" w:lineRule="auto"/>
+              <w:jc w:val="left"/>
             </w:pPr>
             <w:r>
               <w:rPr>
-                <w:sz w:val="18"/>
+                <w:rFonts w:ascii="Times New Roman" w:hAnsi="Times New Roman" w:eastAsia="Times New Roman"/>
+                <w:sz w:val="22"/>
               </w:rPr>
               <w:t>GET /health → status: ok, database: connected.</w:t>
             </w:r>
@@ -1060,9 +1527,12 @@
         </w:tc>
       </w:tr>
       <w:tr>
+        <w:trPr>
+          <w:cantSplit/>
+        </w:trPr>
         <w:tc>
           <w:tcPr>
-            <w:tcW w:type="dxa" w:w="3024"/>
+            <w:tcW w:type="dxa" w:w="2880"/>
             <w:vAlign w:val="center"/>
             <w:tcMar>
               <w:top w:w="100" w:type="dxa"/>
@@ -1073,11 +1543,13 @@
           </w:tcPr>
           <w:p>
             <w:pPr>
-              <w:spacing w:after="20"/>
+              <w:spacing w:after="40" w:line="276" w:lineRule="auto"/>
+              <w:jc w:val="left"/>
             </w:pPr>
             <w:r>
               <w:rPr>
-                <w:sz w:val="18"/>
+                <w:rFonts w:ascii="Times New Roman" w:hAnsi="Times New Roman" w:eastAsia="Times New Roman"/>
+                <w:sz w:val="22"/>
               </w:rPr>
               <w:t>Вхід і профіль</w:t>
             </w:r>
@@ -1085,7 +1557,7 @@
         </w:tc>
         <w:tc>
           <w:tcPr>
-            <w:tcW w:type="dxa" w:w="6696"/>
+            <w:tcW w:type="dxa" w:w="6192"/>
             <w:vAlign w:val="center"/>
             <w:tcMar>
               <w:top w:w="100" w:type="dxa"/>
@@ -1096,11 +1568,13 @@
           </w:tcPr>
           <w:p>
             <w:pPr>
-              <w:spacing w:after="20"/>
+              <w:spacing w:after="40" w:line="276" w:lineRule="auto"/>
+              <w:jc w:val="left"/>
             </w:pPr>
             <w:r>
               <w:rPr>
-                <w:sz w:val="18"/>
+                <w:rFonts w:ascii="Times New Roman" w:hAnsi="Times New Roman" w:eastAsia="Times New Roman"/>
+                <w:sz w:val="22"/>
               </w:rPr>
               <w:t>Вхід адміністратора та працівника; GET /auth/me повернув профіль і роль.</w:t>
             </w:r>
@@ -1108,9 +1582,12 @@
         </w:tc>
       </w:tr>
       <w:tr>
+        <w:trPr>
+          <w:cantSplit/>
+        </w:trPr>
         <w:tc>
           <w:tcPr>
-            <w:tcW w:type="dxa" w:w="3024"/>
+            <w:tcW w:type="dxa" w:w="2880"/>
             <w:vAlign w:val="center"/>
             <w:tcMar>
               <w:top w:w="100" w:type="dxa"/>
@@ -1122,11 +1599,13 @@
           </w:tcPr>
           <w:p>
             <w:pPr>
-              <w:spacing w:after="20"/>
+              <w:spacing w:after="40" w:line="276" w:lineRule="auto"/>
+              <w:jc w:val="left"/>
             </w:pPr>
             <w:r>
               <w:rPr>
-                <w:sz w:val="18"/>
+                <w:rFonts w:ascii="Times New Roman" w:hAnsi="Times New Roman" w:eastAsia="Times New Roman"/>
+                <w:sz w:val="22"/>
               </w:rPr>
               <w:t>Основні дані</w:t>
             </w:r>
@@ -1134,7 +1613,7 @@
         </w:tc>
         <w:tc>
           <w:tcPr>
-            <w:tcW w:type="dxa" w:w="6696"/>
+            <w:tcW w:type="dxa" w:w="6192"/>
             <w:vAlign w:val="center"/>
             <w:tcMar>
               <w:top w:w="100" w:type="dxa"/>
@@ -1146,11 +1625,13 @@
           </w:tcPr>
           <w:p>
             <w:pPr>
-              <w:spacing w:after="20"/>
+              <w:spacing w:after="40" w:line="276" w:lineRule="auto"/>
+              <w:jc w:val="left"/>
             </w:pPr>
             <w:r>
               <w:rPr>
-                <w:sz w:val="18"/>
+                <w:rFonts w:ascii="Times New Roman" w:hAnsi="Times New Roman" w:eastAsia="Times New Roman"/>
+                <w:sz w:val="22"/>
               </w:rPr>
               <w:t>Проєкти, записи часу, розклад, сповіщення, дашборд і аналітика повернули успішні відповіді.</w:t>
             </w:r>
@@ -1158,9 +1639,12 @@
         </w:tc>
       </w:tr>
       <w:tr>
+        <w:trPr>
+          <w:cantSplit/>
+        </w:trPr>
         <w:tc>
           <w:tcPr>
-            <w:tcW w:type="dxa" w:w="3024"/>
+            <w:tcW w:type="dxa" w:w="2880"/>
             <w:vAlign w:val="center"/>
             <w:tcMar>
               <w:top w:w="100" w:type="dxa"/>
@@ -1171,11 +1655,13 @@
           </w:tcPr>
           <w:p>
             <w:pPr>
-              <w:spacing w:after="20"/>
+              <w:spacing w:after="40" w:line="276" w:lineRule="auto"/>
+              <w:jc w:val="left"/>
             </w:pPr>
             <w:r>
               <w:rPr>
-                <w:sz w:val="18"/>
+                <w:rFonts w:ascii="Times New Roman" w:hAnsi="Times New Roman" w:eastAsia="Times New Roman"/>
+                <w:sz w:val="22"/>
               </w:rPr>
               <w:t>Обмеження доступу</w:t>
             </w:r>
@@ -1183,7 +1669,7 @@
         </w:tc>
         <w:tc>
           <w:tcPr>
-            <w:tcW w:type="dxa" w:w="6696"/>
+            <w:tcW w:type="dxa" w:w="6192"/>
             <w:vAlign w:val="center"/>
             <w:tcMar>
               <w:top w:w="100" w:type="dxa"/>
@@ -1194,11 +1680,13 @@
           </w:tcPr>
           <w:p>
             <w:pPr>
-              <w:spacing w:after="20"/>
+              <w:spacing w:after="40" w:line="276" w:lineRule="auto"/>
+              <w:jc w:val="left"/>
             </w:pPr>
             <w:r>
               <w:rPr>
-                <w:sz w:val="18"/>
+                <w:rFonts w:ascii="Times New Roman" w:hAnsi="Times New Roman" w:eastAsia="Times New Roman"/>
+                <w:sz w:val="22"/>
               </w:rPr>
               <w:t>Працівник отримав HTTP 403 на GET /users; адміністратор — успішну відповідь.</w:t>
             </w:r>
@@ -1206,9 +1694,12 @@
         </w:tc>
       </w:tr>
       <w:tr>
+        <w:trPr>
+          <w:cantSplit/>
+        </w:trPr>
         <w:tc>
           <w:tcPr>
-            <w:tcW w:type="dxa" w:w="3024"/>
+            <w:tcW w:type="dxa" w:w="2880"/>
             <w:vAlign w:val="center"/>
             <w:tcMar>
               <w:top w:w="100" w:type="dxa"/>
@@ -1220,11 +1711,13 @@
           </w:tcPr>
           <w:p>
             <w:pPr>
-              <w:spacing w:after="20"/>
+              <w:spacing w:after="40" w:line="276" w:lineRule="auto"/>
+              <w:jc w:val="left"/>
             </w:pPr>
             <w:r>
               <w:rPr>
-                <w:sz w:val="18"/>
+                <w:rFonts w:ascii="Times New Roman" w:hAnsi="Times New Roman" w:eastAsia="Times New Roman"/>
+                <w:sz w:val="22"/>
               </w:rPr>
               <w:t>Інтерфейс і документація</w:t>
             </w:r>
@@ -1232,7 +1725,7 @@
         </w:tc>
         <w:tc>
           <w:tcPr>
-            <w:tcW w:type="dxa" w:w="6696"/>
+            <w:tcW w:type="dxa" w:w="6192"/>
             <w:vAlign w:val="center"/>
             <w:tcMar>
               <w:top w:w="100" w:type="dxa"/>
@@ -1244,11 +1737,13 @@
           </w:tcPr>
           <w:p>
             <w:pPr>
-              <w:spacing w:after="20"/>
+              <w:spacing w:after="40" w:line="276" w:lineRule="auto"/>
+              <w:jc w:val="left"/>
             </w:pPr>
             <w:r>
               <w:rPr>
-                <w:sz w:val="18"/>
+                <w:rFonts w:ascii="Times New Roman" w:hAnsi="Times New Roman" w:eastAsia="Times New Roman"/>
+                <w:sz w:val="22"/>
               </w:rPr>
               <w:t>У браузері перевірено вхід у систему та роботу сторінки; Swagger UI відкриває схему API.</w:t>
             </w:r>
@@ -1258,20 +1753,35 @@
     </w:tbl>
     <w:p>
       <w:pPr>
-        <w:spacing w:after="0"/>
+        <w:spacing w:after="0" w:line="360" w:lineRule="auto"/>
       </w:pPr>
     </w:p>
     <w:p>
       <w:pPr>
         <w:pStyle w:val="Heading1"/>
         <w:keepNext/>
+        <w:spacing w:line="360" w:lineRule="auto" w:before="280" w:after="160"/>
+        <w:jc w:val="left"/>
       </w:pPr>
       <w:r>
+        <w:rPr>
+          <w:rFonts w:ascii="Times New Roman" w:hAnsi="Times New Roman" w:eastAsia="Times New Roman"/>
+          <w:b/>
+          <w:color w:val="000000"/>
+          <w:sz w:val="28"/>
+        </w:rPr>
         <w:t>7. Демонстрація інтерфейсу та API</w:t>
       </w:r>
     </w:p>
     <w:p>
+      <w:pPr>
+        <w:spacing w:line="360" w:lineRule="auto"/>
+      </w:pPr>
       <w:r>
+        <w:rPr>
+          <w:rFonts w:ascii="Times New Roman" w:hAnsi="Times New Roman" w:eastAsia="Times New Roman"/>
+          <w:sz w:val="28"/>
+        </w:rPr>
         <w:drawing>
           <wp:inline xmlns:a="http://schemas.openxmlformats.org/drawingml/2006/main" xmlns:pic="http://schemas.openxmlformats.org/drawingml/2006/picture">
             <wp:extent cx="5989320" cy="4159250"/>
@@ -1308,25 +1818,41 @@
     </w:p>
     <w:p>
       <w:pPr>
-        <w:spacing w:before="40" w:after="160"/>
+        <w:keepLines/>
+        <w:spacing w:before="40" w:after="160" w:line="240" w:lineRule="auto"/>
         <w:jc w:val="center"/>
       </w:pPr>
       <w:r>
         <w:rPr>
-          <w:i/>
-          <w:color w:val="5B6573"/>
-          <w:sz w:val="18"/>
+          <w:rFonts w:ascii="Times New Roman" w:hAnsi="Times New Roman" w:eastAsia="Times New Roman"/>
+          <w:i w:val="0"/>
+          <w:color w:val="000000"/>
+          <w:sz w:val="22"/>
         </w:rPr>
         <w:t>Рисунок 2 – Вхід через FastAPI з обліковими даними користувача</w:t>
       </w:r>
     </w:p>
     <w:p>
+      <w:pPr>
+        <w:spacing w:line="360" w:lineRule="auto"/>
+      </w:pPr>
       <w:r>
+        <w:rPr>
+          <w:rFonts w:ascii="Times New Roman" w:hAnsi="Times New Roman" w:eastAsia="Times New Roman"/>
+          <w:sz w:val="28"/>
+        </w:rPr>
         <w:br w:type="page"/>
       </w:r>
     </w:p>
     <w:p>
+      <w:pPr>
+        <w:spacing w:line="360" w:lineRule="auto"/>
+      </w:pPr>
       <w:r>
+        <w:rPr>
+          <w:rFonts w:ascii="Times New Roman" w:hAnsi="Times New Roman" w:eastAsia="Times New Roman"/>
+          <w:sz w:val="28"/>
+        </w:rPr>
         <w:drawing>
           <wp:inline xmlns:a="http://schemas.openxmlformats.org/drawingml/2006/main" xmlns:pic="http://schemas.openxmlformats.org/drawingml/2006/picture">
             <wp:extent cx="5989320" cy="4159250"/>
@@ -1363,25 +1889,41 @@
     </w:p>
     <w:p>
       <w:pPr>
-        <w:spacing w:before="40" w:after="160"/>
+        <w:keepLines/>
+        <w:spacing w:before="40" w:after="160" w:line="240" w:lineRule="auto"/>
         <w:jc w:val="center"/>
       </w:pPr>
       <w:r>
         <w:rPr>
-          <w:i/>
-          <w:color w:val="5B6573"/>
-          <w:sz w:val="18"/>
+          <w:rFonts w:ascii="Times New Roman" w:hAnsi="Times New Roman" w:eastAsia="Times New Roman"/>
+          <w:i w:val="0"/>
+          <w:color w:val="000000"/>
+          <w:sz w:val="22"/>
         </w:rPr>
         <w:t>Рисунок 3 – Головна сторінка після автентифікації</w:t>
       </w:r>
     </w:p>
     <w:p>
+      <w:pPr>
+        <w:spacing w:line="360" w:lineRule="auto"/>
+      </w:pPr>
       <w:r>
+        <w:rPr>
+          <w:rFonts w:ascii="Times New Roman" w:hAnsi="Times New Roman" w:eastAsia="Times New Roman"/>
+          <w:sz w:val="28"/>
+        </w:rPr>
         <w:br w:type="page"/>
       </w:r>
     </w:p>
     <w:p>
+      <w:pPr>
+        <w:spacing w:line="360" w:lineRule="auto"/>
+      </w:pPr>
       <w:r>
+        <w:rPr>
+          <w:rFonts w:ascii="Times New Roman" w:hAnsi="Times New Roman" w:eastAsia="Times New Roman"/>
+          <w:sz w:val="28"/>
+        </w:rPr>
         <w:drawing>
           <wp:inline xmlns:a="http://schemas.openxmlformats.org/drawingml/2006/main" xmlns:pic="http://schemas.openxmlformats.org/drawingml/2006/picture">
             <wp:extent cx="5989320" cy="4575175"/>
@@ -1418,14 +1960,16 @@
     </w:p>
     <w:p>
       <w:pPr>
-        <w:spacing w:before="40" w:after="160"/>
+        <w:keepLines/>
+        <w:spacing w:before="40" w:after="160" w:line="240" w:lineRule="auto"/>
         <w:jc w:val="center"/>
       </w:pPr>
       <w:r>
         <w:rPr>
-          <w:i/>
-          <w:color w:val="5B6573"/>
-          <w:sz w:val="18"/>
+          <w:rFonts w:ascii="Times New Roman" w:hAnsi="Times New Roman" w:eastAsia="Times New Roman"/>
+          <w:i w:val="0"/>
+          <w:color w:val="000000"/>
+          <w:sz w:val="22"/>
         </w:rPr>
         <w:t>Рисунок 4 – OpenAPI документація FastAPI у Swagger UI</w:t>
       </w:r>
@@ -1434,26 +1978,50 @@
       <w:pPr>
         <w:pStyle w:val="Heading1"/>
         <w:keepNext/>
+        <w:spacing w:line="360" w:lineRule="auto" w:before="280" w:after="160"/>
+        <w:jc w:val="left"/>
       </w:pPr>
       <w:r>
+        <w:rPr>
+          <w:rFonts w:ascii="Times New Roman" w:hAnsi="Times New Roman" w:eastAsia="Times New Roman"/>
+          <w:b/>
+          <w:color w:val="000000"/>
+          <w:sz w:val="28"/>
+        </w:rPr>
         <w:t>8. Репозиторій і висновок</w:t>
       </w:r>
     </w:p>
     <w:p>
+      <w:pPr>
+        <w:spacing w:line="360" w:lineRule="auto"/>
+        <w:jc w:val="both"/>
+      </w:pPr>
       <w:r>
-        <w:t>Вихідний код лабораторних робіт і backend опубліковано в GitHub-репозиторії: https://github.com/modertokuniversity/practic .</w:t>
+        <w:rPr>
+          <w:rFonts w:ascii="Times New Roman" w:hAnsi="Times New Roman" w:eastAsia="Times New Roman"/>
+          <w:sz w:val="28"/>
+        </w:rPr>
+        <w:t>Вихідний код лабораторних робіт і backend призначений для публікації в GitHub-репозиторії: https://github.com/modertokuniversity/practic.</w:t>
       </w:r>
     </w:p>
     <w:p>
+      <w:pPr>
+        <w:spacing w:line="360" w:lineRule="auto"/>
+        <w:jc w:val="both"/>
+      </w:pPr>
       <w:r>
+        <w:rPr>
+          <w:rFonts w:ascii="Times New Roman" w:hAnsi="Times New Roman" w:eastAsia="Times New Roman"/>
+          <w:sz w:val="28"/>
+        </w:rPr>
         <w:t>Під час роботи реалізовано серверну частину на FastAPI відповідно до раніше обраної багаторівневої архітектури. Backend повторно використовує готову PostgreSQL схему й підключений до готового Next.js інтерфейсу через узгоджений REST-контракт. Реалізовано перевірку даних, JWT-автентифікацію, рольові обмеження, бізнес-сценарії обліку часу та контейнерний запуск. Перевірені API-запити підтвердили з’єднання з БД та роботу ключових сценаріїв.</w:t>
       </w:r>
     </w:p>
     <w:sectPr>
       <w:headerReference w:type="default" r:id="rId9"/>
       <w:footerReference w:type="default" r:id="rId10"/>
-      <w:pgSz w:w="12240" w:h="15840"/>
-      <w:pgMar w:top="1037" w:right="1181" w:bottom="1037" w:left="1181" w:header="720" w:footer="720" w:gutter="0"/>
+      <w:pgSz w:w="11906" w:h="16838"/>
+      <w:pgMar w:top="1134" w:right="850" w:bottom="1134" w:left="1701" w:header="720" w:footer="720" w:gutter="0"/>
       <w:cols w:space="720"/>
       <w:docGrid w:linePitch="360"/>
     </w:sectPr>
@@ -1468,14 +2036,7 @@
       <w:pStyle w:val="Footer"/>
       <w:jc w:val="center"/>
     </w:pPr>
-    <w:r>
-      <w:rPr>
-        <w:color w:val="5B6573"/>
-        <w:sz w:val="16"/>
-      </w:rPr>
-      <w:t xml:space="preserve">Лабораторна робота № 8–10  ·  </w:t>
-    </w:r>
-    <w:fldSimple w:instr="PAGE"/>
+    <w:r/>
   </w:p>
 </w:ftr>
 </file>
@@ -1487,14 +2048,7 @@
       <w:pStyle w:val="Header"/>
       <w:jc w:val="right"/>
     </w:pPr>
-    <w:r>
-      <w:rPr>
-        <w:rFonts w:ascii="Arial" w:hAnsi="Arial"/>
-        <w:color w:val="5B6573"/>
-        <w:sz w:val="16"/>
-      </w:rPr>
-      <w:t>ПРОФЕСІЙНА ПРАКТИКА ПРОГРАМНОЇ ІНЖЕНЕРІЇ</w:t>
-    </w:r>
+    <w:r/>
   </w:p>
 </w:hdr>
 </file>
@@ -1863,12 +2417,12 @@
     <w:qFormat/>
     <w:rsid w:val="00FC693F"/>
     <w:pPr>
-      <w:spacing w:after="120" w:line="269" w:lineRule="auto"/>
+      <w:spacing w:after="120" w:line="360" w:lineRule="auto"/>
     </w:pPr>
     <w:rPr>
-      <w:rFonts w:ascii="Arial" w:hAnsi="Arial" w:eastAsia="Arial"/>
+      <w:rFonts w:ascii="Times New Roman" w:hAnsi="Times New Roman" w:eastAsia="Times New Roman"/>
       <w:color w:val="202833"/>
-      <w:sz w:val="21"/>
+      <w:sz w:val="28"/>
     </w:rPr>
   </w:style>
   <w:style w:type="paragraph" w:styleId="Header">

</xml_diff>

<commit_message>
Honor local env overrides for the isolated compose stack
</commit_message>
<xml_diff>
--- a/lab8_10_backend/Лабораторна робота №8-10 - Гнатишак Андрій.docx
+++ b/lab8_10_backend/Лабораторна робота №8-10 - Гнатишак Андрій.docx
@@ -1292,7 +1292,7 @@
           <w:rFonts w:ascii="Times New Roman" w:hAnsi="Times New Roman" w:eastAsia="Times New Roman"/>
           <w:sz w:val="28"/>
         </w:rPr>
-        <w:t>Окремий Compose-проєкт запускає власні PostgreSQL, FastAPI та Next.js контейнери в окремій мережі й з окремим томом бази. Для створення схеми та початкових даних він повторно використовує SQL-файли лабораторної №5; запуск лабораторної №5 при цьому не потрібен. Параметри навчального входу описані у .env.example.</w:t>
+        <w:t>Файл .env.example містить навчальні значення. За потреби його копіюють у .env та замінюють JWT_SECRET і DEMO_USER_PASSWORD.</w:t>
       </w:r>
     </w:p>
     <w:p>
@@ -2001,7 +2001,7 @@
           <w:rFonts w:ascii="Times New Roman" w:hAnsi="Times New Roman" w:eastAsia="Times New Roman"/>
           <w:sz w:val="28"/>
         </w:rPr>
-        <w:t>Вихідний код лабораторних робіт і backend призначений для публікації в GitHub-репозиторії: https://github.com/modertokuniversity/practic.</w:t>
+        <w:t>Вихідний код лабораторних робіт і backend опубліковано у GitHub-репозиторії: https://github.com/modertokuniversity/practic.</w:t>
       </w:r>
     </w:p>
     <w:p>

</xml_diff>